<commit_message>
feat: improve exam note DOCX readability
</commit_message>
<xml_diff>
--- a/build-exam-master-note/assets/master-note-template.docx
+++ b/build-exam-master-note/assets/master-note-template.docx
@@ -3,10 +3,10 @@
 <w:document xmlns:wpc="http://schemas.microsoft.com/office/word/2010/wordprocessingCanvas" xmlns:mo="http://schemas.microsoft.com/office/mac/office/2008/main" xmlns:mc="http://schemas.openxmlformats.org/markup-compatibility/2006" xmlns:mv="urn:schemas-microsoft-com:mac:vml" xmlns:o="urn:schemas-microsoft-com:office:office" xmlns:r="http://schemas.openxmlformats.org/officeDocument/2006/relationships" xmlns:m="http://schemas.openxmlformats.org/officeDocument/2006/math" xmlns:v="urn:schemas-microsoft-com:vml" xmlns:wp14="http://schemas.microsoft.com/office/word/2010/wordprocessingDrawing" xmlns:wp="http://schemas.openxmlformats.org/drawingml/2006/wordprocessingDrawing" xmlns:w10="urn:schemas-microsoft-com:office:word" xmlns:w="http://schemas.openxmlformats.org/wordprocessingml/2006/main" xmlns:w14="http://schemas.microsoft.com/office/word/2010/wordml" xmlns:wpg="http://schemas.microsoft.com/office/word/2010/wordprocessingGroup" xmlns:wpi="http://schemas.microsoft.com/office/word/2010/wordprocessingInk" xmlns:wne="http://schemas.microsoft.com/office/word/2006/wordml" xmlns:wps="http://schemas.microsoft.com/office/word/2010/wordprocessingShape" mc:Ignorable="w14 wp14">
   <w:body>
     <w:sectPr>
-      <w:headerReference w:type="default" r:id="rId9"/>
-      <w:footerReference w:type="default" r:id="rId10"/>
-      <w:pgSz w:w="12240" w:h="15840"/>
-      <w:pgMar w:top="1440" w:right="1440" w:bottom="1440" w:left="1440" w:header="708" w:footer="708" w:gutter="0"/>
+      <w:footerReference w:type="default" r:id="rId9"/>
+      <w:headerReference w:type="default" r:id="rId10"/>
+      <w:pgSz w:w="11906" w:h="16838"/>
+      <w:pgMar w:top="1134" w:right="964" w:bottom="1134" w:left="964" w:header="567" w:footer="567" w:gutter="0"/>
       <w:cols w:space="720"/>
       <w:docGrid w:linePitch="360"/>
     </w:sectPr>
@@ -16,39 +16,13 @@
 
 <file path=word/footer1.xml><?xml version="1.0" encoding="utf-8"?>
 <w:ftr xmlns:m="http://schemas.openxmlformats.org/officeDocument/2006/math" xmlns:mc="http://schemas.openxmlformats.org/markup-compatibility/2006" xmlns:mo="http://schemas.microsoft.com/office/mac/office/2008/main" xmlns:mv="urn:schemas-microsoft-com:mac:vml" xmlns:o="urn:schemas-microsoft-com:office:office" xmlns:r="http://schemas.openxmlformats.org/officeDocument/2006/relationships" xmlns:v="urn:schemas-microsoft-com:vml" xmlns:w10="urn:schemas-microsoft-com:office:word" xmlns:w14="http://schemas.microsoft.com/office/word/2010/wordml" xmlns:w="http://schemas.openxmlformats.org/wordprocessingml/2006/main" xmlns:wne="http://schemas.microsoft.com/office/word/2006/wordml" xmlns:wp14="http://schemas.microsoft.com/office/word/2010/wordprocessingDrawing" xmlns:wp="http://schemas.openxmlformats.org/drawingml/2006/wordprocessingDrawing" xmlns:wpc="http://schemas.microsoft.com/office/word/2010/wordprocessingCanvas" xmlns:wpg="http://schemas.microsoft.com/office/word/2010/wordprocessingGroup" xmlns:wpi="http://schemas.microsoft.com/office/word/2010/wordprocessingInk" xmlns:wps="http://schemas.microsoft.com/office/word/2010/wordprocessingShape" mc:Ignorable="w14 wp14">
-  <w:p>
-    <w:pPr>
-      <w:pStyle w:val="Footer"/>
-      <w:jc w:val="right"/>
-    </w:pPr>
-    <w:r>
-      <w:rPr>
-        <w:rFonts w:ascii="Malgun Gothic" w:hAnsi="Malgun Gothic" w:eastAsia="Malgun Gothic"/>
-        <w:sz w:val="18"/>
-      </w:rPr>
-      <w:t xml:space="preserve">Page </w:t>
-    </w:r>
-    <w:fldSimple w:instr="PAGE"/>
-  </w:p>
+  <w:p/>
 </w:ftr>
 </file>
 
 <file path=word/header1.xml><?xml version="1.0" encoding="utf-8"?>
 <w:hdr xmlns:m="http://schemas.openxmlformats.org/officeDocument/2006/math" xmlns:mc="http://schemas.openxmlformats.org/markup-compatibility/2006" xmlns:mo="http://schemas.microsoft.com/office/mac/office/2008/main" xmlns:mv="urn:schemas-microsoft-com:mac:vml" xmlns:o="urn:schemas-microsoft-com:office:office" xmlns:r="http://schemas.openxmlformats.org/officeDocument/2006/relationships" xmlns:v="urn:schemas-microsoft-com:vml" xmlns:w10="urn:schemas-microsoft-com:office:word" xmlns:w14="http://schemas.microsoft.com/office/word/2010/wordml" xmlns:w="http://schemas.openxmlformats.org/wordprocessingml/2006/main" xmlns:wne="http://schemas.microsoft.com/office/word/2006/wordml" xmlns:wp14="http://schemas.microsoft.com/office/word/2010/wordprocessingDrawing" xmlns:wp="http://schemas.openxmlformats.org/drawingml/2006/wordprocessingDrawing" xmlns:wpc="http://schemas.microsoft.com/office/word/2010/wordprocessingCanvas" xmlns:wpg="http://schemas.microsoft.com/office/word/2010/wordprocessingGroup" xmlns:wpi="http://schemas.microsoft.com/office/word/2010/wordprocessingInk" xmlns:wps="http://schemas.microsoft.com/office/word/2010/wordprocessingShape" mc:Ignorable="w14 wp14">
-  <w:p>
-    <w:pPr>
-      <w:pStyle w:val="Header"/>
-      <w:jc w:val="left"/>
-    </w:pPr>
-    <w:r>
-      <w:rPr>
-        <w:rFonts w:ascii="Malgun Gothic" w:hAnsi="Malgun Gothic" w:eastAsia="Malgun Gothic"/>
-        <w:color w:val="667085"/>
-        <w:sz w:val="18"/>
-      </w:rPr>
-      <w:t>시험 단권화 노트</w:t>
-    </w:r>
-  </w:p>
+  <w:p/>
 </w:hdr>
 </file>
 
@@ -416,12 +390,12 @@
     <w:qFormat/>
     <w:rsid w:val="00FC693F"/>
     <w:pPr>
-      <w:spacing w:before="0" w:after="120" w:line="300" w:lineRule="auto"/>
+      <w:spacing w:before="0" w:after="80" w:line="276" w:lineRule="auto"/>
     </w:pPr>
     <w:rPr>
       <w:rFonts w:ascii="Malgun Gothic" w:hAnsi="Malgun Gothic" w:eastAsia="Malgun Gothic"/>
       <w:color w:val="000000"/>
-      <w:sz w:val="22"/>
+      <w:sz w:val="20"/>
     </w:rPr>
   </w:style>
   <w:style w:type="paragraph" w:styleId="Header">
@@ -527,7 +501,7 @@
     <w:pPr>
       <w:keepNext/>
       <w:keepLines/>
-      <w:spacing w:before="200" w:after="100" w:line="240" w:lineRule="auto"/>
+      <w:spacing w:before="160" w:after="100" w:line="240" w:lineRule="auto"/>
       <w:outlineLvl w:val="2"/>
     </w:pPr>
     <w:rPr>
@@ -535,7 +509,7 @@
       <w:b/>
       <w:bCs/>
       <w:color w:val="1F4D78"/>
-      <w:sz w:val="24"/>
+      <w:sz w:val="22"/>
     </w:rPr>
   </w:style>
   <w:style w:type="paragraph" w:styleId="Heading4">

</xml_diff>